<commit_message>
task 1 college logo and task 3 doc upload
</commit_message>
<xml_diff>
--- a/Task Document/Task 1.docx
+++ b/Task Document/Task 1.docx
@@ -291,6 +291,9 @@
     </w:p>
     <w:p>
       <w:r>
+        <w:rPr>
+          <w:noProof/>
+        </w:rPr>
         <w:drawing>
           <wp:inline distT="0" distB="0" distL="0" distR="0" wp14:anchorId="16D7BC75" wp14:editId="43F551C6">
             <wp:extent cx="5943600" cy="753110"/>
@@ -307,7 +310,7 @@
                     <pic:cNvPicPr/>
                   </pic:nvPicPr>
                   <pic:blipFill>
-                    <a:blip r:embed="rId4"/>
+                    <a:blip r:embed="rId6"/>
                     <a:stretch>
                       <a:fillRect/>
                     </a:stretch>
@@ -335,6 +338,9 @@
     </w:p>
     <w:p>
       <w:r>
+        <w:rPr>
+          <w:noProof/>
+        </w:rPr>
         <w:drawing>
           <wp:inline distT="0" distB="0" distL="0" distR="0" wp14:anchorId="6E883EC9" wp14:editId="798F42FF">
             <wp:extent cx="5943600" cy="930910"/>
@@ -351,7 +357,7 @@
                     <pic:cNvPicPr/>
                   </pic:nvPicPr>
                   <pic:blipFill>
-                    <a:blip r:embed="rId5"/>
+                    <a:blip r:embed="rId7"/>
                     <a:stretch>
                       <a:fillRect/>
                     </a:stretch>
@@ -379,6 +385,9 @@
     </w:p>
     <w:p>
       <w:r>
+        <w:rPr>
+          <w:noProof/>
+        </w:rPr>
         <w:drawing>
           <wp:inline distT="0" distB="0" distL="0" distR="0" wp14:anchorId="1EC17EFE" wp14:editId="00318E79">
             <wp:extent cx="3223539" cy="723963"/>
@@ -395,7 +404,7 @@
                     <pic:cNvPicPr/>
                   </pic:nvPicPr>
                   <pic:blipFill>
-                    <a:blip r:embed="rId6"/>
+                    <a:blip r:embed="rId8"/>
                     <a:stretch>
                       <a:fillRect/>
                     </a:stretch>
@@ -419,12 +428,19 @@
     <w:p/>
     <w:p>
       <w:r>
+        <w:lastRenderedPageBreak/>
         <w:t>Step 2: Create the project folder</w:t>
       </w:r>
     </w:p>
     <w:p/>
     <w:p/>
     <w:sectPr>
+      <w:headerReference w:type="even" r:id="rId9"/>
+      <w:headerReference w:type="default" r:id="rId10"/>
+      <w:footerReference w:type="even" r:id="rId11"/>
+      <w:footerReference w:type="default" r:id="rId12"/>
+      <w:headerReference w:type="first" r:id="rId13"/>
+      <w:footerReference w:type="first" r:id="rId14"/>
       <w:pgSz w:w="12240" w:h="15840"/>
       <w:pgMar w:top="1440" w:right="1440" w:bottom="1440" w:left="1440" w:header="708" w:footer="708" w:gutter="0"/>
       <w:cols w:space="708"/>
@@ -432,6 +448,221 @@
     </w:sectPr>
   </w:body>
 </w:document>
+</file>
+
+<file path=word/endnotes.xml><?xml version="1.0" encoding="utf-8"?>
+<w:endnotes xmlns:wpc="http://schemas.microsoft.com/office/word/2010/wordprocessingCanvas" xmlns:cx="http://schemas.microsoft.com/office/drawing/2014/chartex" xmlns:cx1="http://schemas.microsoft.com/office/drawing/2015/9/8/chartex" xmlns:cx2="http://schemas.microsoft.com/office/drawing/2015/10/21/chartex" xmlns:cx3="http://schemas.microsoft.com/office/drawing/2016/5/9/chartex" xmlns:cx4="http://schemas.microsoft.com/office/drawing/2016/5/10/chartex" xmlns:cx5="http://schemas.microsoft.com/office/drawing/2016/5/11/chartex" xmlns:cx6="http://schemas.microsoft.com/office/drawing/2016/5/12/chartex" xmlns:cx7="http://schemas.microsoft.com/office/drawing/2016/5/13/chartex" xmlns:cx8="http://schemas.microsoft.com/office/drawing/2016/5/14/chartex" xmlns:mc="http://schemas.openxmlformats.org/markup-compatibility/2006" xmlns:aink="http://schemas.microsoft.com/office/drawing/2016/ink" xmlns:am3d="http://schemas.microsoft.com/office/drawing/2017/model3d" xmlns:o="urn:schemas-microsoft-com:office:office" xmlns:oel="http://schemas.microsoft.com/office/2019/extlst" xmlns:r="http://schemas.openxmlformats.org/officeDocument/2006/relationships" xmlns:m="http://schemas.openxmlformats.org/officeDocument/2006/math" xmlns:v="urn:schemas-microsoft-com:vml" xmlns:wp14="http://schemas.microsoft.com/office/word/2010/wordprocessingDrawing" xmlns:wp="http://schemas.openxmlformats.org/drawingml/2006/wordprocessingDrawing" xmlns:w10="urn:schemas-microsoft-com:office:word" xmlns:w="http://schemas.openxmlformats.org/wordprocessingml/2006/main" xmlns:w14="http://schemas.microsoft.com/office/word/2010/wordml" xmlns:w15="http://schemas.microsoft.com/office/word/2012/wordml" xmlns:w16cex="http://schemas.microsoft.com/office/word/2018/wordml/cex" xmlns:w16cid="http://schemas.microsoft.com/office/word/2016/wordml/cid" xmlns:w16="http://schemas.microsoft.com/office/word/2018/wordml" xmlns:w16du="http://schemas.microsoft.com/office/word/2023/wordml/word16du" xmlns:w16sdtdh="http://schemas.microsoft.com/office/word/2020/wordml/sdtdatahash" xmlns:w16sdtfl="http://schemas.microsoft.com/office/word/2024/wordml/sdtformatlock" xmlns:w16se="http://schemas.microsoft.com/office/word/2015/wordml/symex" xmlns:wpg="http://schemas.microsoft.com/office/word/2010/wordprocessingGroup" xmlns:wpi="http://schemas.microsoft.com/office/word/2010/wordprocessingInk" xmlns:wne="http://schemas.microsoft.com/office/word/2006/wordml" xmlns:wps="http://schemas.microsoft.com/office/word/2010/wordprocessingShape" mc:Ignorable="w14 w15 w16se w16cid w16 w16cex w16sdtdh w16sdtfl w16du wp14">
+  <w:endnote w:type="separator" w:id="-1">
+    <w:p>
+      <w:pPr>
+        <w:spacing w:after="0" w:line="240" w:lineRule="auto"/>
+      </w:pPr>
+      <w:r>
+        <w:separator/>
+      </w:r>
+    </w:p>
+  </w:endnote>
+  <w:endnote w:type="continuationSeparator" w:id="0">
+    <w:p>
+      <w:pPr>
+        <w:spacing w:after="0" w:line="240" w:lineRule="auto"/>
+      </w:pPr>
+      <w:r>
+        <w:continuationSeparator/>
+      </w:r>
+    </w:p>
+  </w:endnote>
+</w:endnotes>
+</file>
+
+<file path=word/footer1.xml><?xml version="1.0" encoding="utf-8"?>
+<w:ftr xmlns:wpc="http://schemas.microsoft.com/office/word/2010/wordprocessingCanvas" xmlns:cx="http://schemas.microsoft.com/office/drawing/2014/chartex" xmlns:cx1="http://schemas.microsoft.com/office/drawing/2015/9/8/chartex" xmlns:cx2="http://schemas.microsoft.com/office/drawing/2015/10/21/chartex" xmlns:cx3="http://schemas.microsoft.com/office/drawing/2016/5/9/chartex" xmlns:cx4="http://schemas.microsoft.com/office/drawing/2016/5/10/chartex" xmlns:cx5="http://schemas.microsoft.com/office/drawing/2016/5/11/chartex" xmlns:cx6="http://schemas.microsoft.com/office/drawing/2016/5/12/chartex" xmlns:cx7="http://schemas.microsoft.com/office/drawing/2016/5/13/chartex" xmlns:cx8="http://schemas.microsoft.com/office/drawing/2016/5/14/chartex" xmlns:mc="http://schemas.openxmlformats.org/markup-compatibility/2006" xmlns:aink="http://schemas.microsoft.com/office/drawing/2016/ink" xmlns:am3d="http://schemas.microsoft.com/office/drawing/2017/model3d" xmlns:o="urn:schemas-microsoft-com:office:office" xmlns:oel="http://schemas.microsoft.com/office/2019/extlst" xmlns:r="http://schemas.openxmlformats.org/officeDocument/2006/relationships" xmlns:m="http://schemas.openxmlformats.org/officeDocument/2006/math" xmlns:v="urn:schemas-microsoft-com:vml" xmlns:wp14="http://schemas.microsoft.com/office/word/2010/wordprocessingDrawing" xmlns:wp="http://schemas.openxmlformats.org/drawingml/2006/wordprocessingDrawing" xmlns:w10="urn:schemas-microsoft-com:office:word" xmlns:w="http://schemas.openxmlformats.org/wordprocessingml/2006/main" xmlns:w14="http://schemas.microsoft.com/office/word/2010/wordml" xmlns:w15="http://schemas.microsoft.com/office/word/2012/wordml" xmlns:w16cex="http://schemas.microsoft.com/office/word/2018/wordml/cex" xmlns:w16cid="http://schemas.microsoft.com/office/word/2016/wordml/cid" xmlns:w16="http://schemas.microsoft.com/office/word/2018/wordml" xmlns:w16du="http://schemas.microsoft.com/office/word/2023/wordml/word16du" xmlns:w16sdtdh="http://schemas.microsoft.com/office/word/2020/wordml/sdtdatahash" xmlns:w16sdtfl="http://schemas.microsoft.com/office/word/2024/wordml/sdtformatlock" xmlns:w16se="http://schemas.microsoft.com/office/word/2015/wordml/symex" xmlns:wpg="http://schemas.microsoft.com/office/word/2010/wordprocessingGroup" xmlns:wpi="http://schemas.microsoft.com/office/word/2010/wordprocessingInk" xmlns:wne="http://schemas.microsoft.com/office/word/2006/wordml" xmlns:wps="http://schemas.microsoft.com/office/word/2010/wordprocessingShape" mc:Ignorable="w14 w15 w16se w16cid w16 w16cex w16sdtdh w16sdtfl w16du wp14">
+  <w:p>
+    <w:pPr>
+      <w:pStyle w:val="Footer"/>
+    </w:pPr>
+  </w:p>
+</w:ftr>
+</file>
+
+<file path=word/footer2.xml><?xml version="1.0" encoding="utf-8"?>
+<w:ftr xmlns:wpc="http://schemas.microsoft.com/office/word/2010/wordprocessingCanvas" xmlns:cx="http://schemas.microsoft.com/office/drawing/2014/chartex" xmlns:cx1="http://schemas.microsoft.com/office/drawing/2015/9/8/chartex" xmlns:cx2="http://schemas.microsoft.com/office/drawing/2015/10/21/chartex" xmlns:cx3="http://schemas.microsoft.com/office/drawing/2016/5/9/chartex" xmlns:cx4="http://schemas.microsoft.com/office/drawing/2016/5/10/chartex" xmlns:cx5="http://schemas.microsoft.com/office/drawing/2016/5/11/chartex" xmlns:cx6="http://schemas.microsoft.com/office/drawing/2016/5/12/chartex" xmlns:cx7="http://schemas.microsoft.com/office/drawing/2016/5/13/chartex" xmlns:cx8="http://schemas.microsoft.com/office/drawing/2016/5/14/chartex" xmlns:mc="http://schemas.openxmlformats.org/markup-compatibility/2006" xmlns:aink="http://schemas.microsoft.com/office/drawing/2016/ink" xmlns:am3d="http://schemas.microsoft.com/office/drawing/2017/model3d" xmlns:o="urn:schemas-microsoft-com:office:office" xmlns:oel="http://schemas.microsoft.com/office/2019/extlst" xmlns:r="http://schemas.openxmlformats.org/officeDocument/2006/relationships" xmlns:m="http://schemas.openxmlformats.org/officeDocument/2006/math" xmlns:v="urn:schemas-microsoft-com:vml" xmlns:wp14="http://schemas.microsoft.com/office/word/2010/wordprocessingDrawing" xmlns:wp="http://schemas.openxmlformats.org/drawingml/2006/wordprocessingDrawing" xmlns:w10="urn:schemas-microsoft-com:office:word" xmlns:w="http://schemas.openxmlformats.org/wordprocessingml/2006/main" xmlns:w14="http://schemas.microsoft.com/office/word/2010/wordml" xmlns:w15="http://schemas.microsoft.com/office/word/2012/wordml" xmlns:w16cex="http://schemas.microsoft.com/office/word/2018/wordml/cex" xmlns:w16cid="http://schemas.microsoft.com/office/word/2016/wordml/cid" xmlns:w16="http://schemas.microsoft.com/office/word/2018/wordml" xmlns:w16du="http://schemas.microsoft.com/office/word/2023/wordml/word16du" xmlns:w16sdtdh="http://schemas.microsoft.com/office/word/2020/wordml/sdtdatahash" xmlns:w16sdtfl="http://schemas.microsoft.com/office/word/2024/wordml/sdtformatlock" xmlns:w16se="http://schemas.microsoft.com/office/word/2015/wordml/symex" xmlns:wpg="http://schemas.microsoft.com/office/word/2010/wordprocessingGroup" xmlns:wpi="http://schemas.microsoft.com/office/word/2010/wordprocessingInk" xmlns:wne="http://schemas.microsoft.com/office/word/2006/wordml" xmlns:wps="http://schemas.microsoft.com/office/word/2010/wordprocessingShape" mc:Ignorable="w14 w15 w16se w16cid w16 w16cex w16sdtdh w16sdtfl w16du wp14">
+  <w:p>
+    <w:pPr>
+      <w:pStyle w:val="Footer"/>
+    </w:pPr>
+  </w:p>
+</w:ftr>
+</file>
+
+<file path=word/footer3.xml><?xml version="1.0" encoding="utf-8"?>
+<w:ftr xmlns:wpc="http://schemas.microsoft.com/office/word/2010/wordprocessingCanvas" xmlns:cx="http://schemas.microsoft.com/office/drawing/2014/chartex" xmlns:cx1="http://schemas.microsoft.com/office/drawing/2015/9/8/chartex" xmlns:cx2="http://schemas.microsoft.com/office/drawing/2015/10/21/chartex" xmlns:cx3="http://schemas.microsoft.com/office/drawing/2016/5/9/chartex" xmlns:cx4="http://schemas.microsoft.com/office/drawing/2016/5/10/chartex" xmlns:cx5="http://schemas.microsoft.com/office/drawing/2016/5/11/chartex" xmlns:cx6="http://schemas.microsoft.com/office/drawing/2016/5/12/chartex" xmlns:cx7="http://schemas.microsoft.com/office/drawing/2016/5/13/chartex" xmlns:cx8="http://schemas.microsoft.com/office/drawing/2016/5/14/chartex" xmlns:mc="http://schemas.openxmlformats.org/markup-compatibility/2006" xmlns:aink="http://schemas.microsoft.com/office/drawing/2016/ink" xmlns:am3d="http://schemas.microsoft.com/office/drawing/2017/model3d" xmlns:o="urn:schemas-microsoft-com:office:office" xmlns:oel="http://schemas.microsoft.com/office/2019/extlst" xmlns:r="http://schemas.openxmlformats.org/officeDocument/2006/relationships" xmlns:m="http://schemas.openxmlformats.org/officeDocument/2006/math" xmlns:v="urn:schemas-microsoft-com:vml" xmlns:wp14="http://schemas.microsoft.com/office/word/2010/wordprocessingDrawing" xmlns:wp="http://schemas.openxmlformats.org/drawingml/2006/wordprocessingDrawing" xmlns:w10="urn:schemas-microsoft-com:office:word" xmlns:w="http://schemas.openxmlformats.org/wordprocessingml/2006/main" xmlns:w14="http://schemas.microsoft.com/office/word/2010/wordml" xmlns:w15="http://schemas.microsoft.com/office/word/2012/wordml" xmlns:w16cex="http://schemas.microsoft.com/office/word/2018/wordml/cex" xmlns:w16cid="http://schemas.microsoft.com/office/word/2016/wordml/cid" xmlns:w16="http://schemas.microsoft.com/office/word/2018/wordml" xmlns:w16du="http://schemas.microsoft.com/office/word/2023/wordml/word16du" xmlns:w16sdtdh="http://schemas.microsoft.com/office/word/2020/wordml/sdtdatahash" xmlns:w16sdtfl="http://schemas.microsoft.com/office/word/2024/wordml/sdtformatlock" xmlns:w16se="http://schemas.microsoft.com/office/word/2015/wordml/symex" xmlns:wpg="http://schemas.microsoft.com/office/word/2010/wordprocessingGroup" xmlns:wpi="http://schemas.microsoft.com/office/word/2010/wordprocessingInk" xmlns:wne="http://schemas.microsoft.com/office/word/2006/wordml" xmlns:wps="http://schemas.microsoft.com/office/word/2010/wordprocessingShape" mc:Ignorable="w14 w15 w16se w16cid w16 w16cex w16sdtdh w16sdtfl w16du wp14">
+  <w:p>
+    <w:pPr>
+      <w:pStyle w:val="Footer"/>
+    </w:pPr>
+  </w:p>
+</w:ftr>
+</file>
+
+<file path=word/footnotes.xml><?xml version="1.0" encoding="utf-8"?>
+<w:footnotes xmlns:wpc="http://schemas.microsoft.com/office/word/2010/wordprocessingCanvas" xmlns:cx="http://schemas.microsoft.com/office/drawing/2014/chartex" xmlns:cx1="http://schemas.microsoft.com/office/drawing/2015/9/8/chartex" xmlns:cx2="http://schemas.microsoft.com/office/drawing/2015/10/21/chartex" xmlns:cx3="http://schemas.microsoft.com/office/drawing/2016/5/9/chartex" xmlns:cx4="http://schemas.microsoft.com/office/drawing/2016/5/10/chartex" xmlns:cx5="http://schemas.microsoft.com/office/drawing/2016/5/11/chartex" xmlns:cx6="http://schemas.microsoft.com/office/drawing/2016/5/12/chartex" xmlns:cx7="http://schemas.microsoft.com/office/drawing/2016/5/13/chartex" xmlns:cx8="http://schemas.microsoft.com/office/drawing/2016/5/14/chartex" xmlns:mc="http://schemas.openxmlformats.org/markup-compatibility/2006" xmlns:aink="http://schemas.microsoft.com/office/drawing/2016/ink" xmlns:am3d="http://schemas.microsoft.com/office/drawing/2017/model3d" xmlns:o="urn:schemas-microsoft-com:office:office" xmlns:oel="http://schemas.microsoft.com/office/2019/extlst" xmlns:r="http://schemas.openxmlformats.org/officeDocument/2006/relationships" xmlns:m="http://schemas.openxmlformats.org/officeDocument/2006/math" xmlns:v="urn:schemas-microsoft-com:vml" xmlns:wp14="http://schemas.microsoft.com/office/word/2010/wordprocessingDrawing" xmlns:wp="http://schemas.openxmlformats.org/drawingml/2006/wordprocessingDrawing" xmlns:w10="urn:schemas-microsoft-com:office:word" xmlns:w="http://schemas.openxmlformats.org/wordprocessingml/2006/main" xmlns:w14="http://schemas.microsoft.com/office/word/2010/wordml" xmlns:w15="http://schemas.microsoft.com/office/word/2012/wordml" xmlns:w16cex="http://schemas.microsoft.com/office/word/2018/wordml/cex" xmlns:w16cid="http://schemas.microsoft.com/office/word/2016/wordml/cid" xmlns:w16="http://schemas.microsoft.com/office/word/2018/wordml" xmlns:w16du="http://schemas.microsoft.com/office/word/2023/wordml/word16du" xmlns:w16sdtdh="http://schemas.microsoft.com/office/word/2020/wordml/sdtdatahash" xmlns:w16sdtfl="http://schemas.microsoft.com/office/word/2024/wordml/sdtformatlock" xmlns:w16se="http://schemas.microsoft.com/office/word/2015/wordml/symex" xmlns:wpg="http://schemas.microsoft.com/office/word/2010/wordprocessingGroup" xmlns:wpi="http://schemas.microsoft.com/office/word/2010/wordprocessingInk" xmlns:wne="http://schemas.microsoft.com/office/word/2006/wordml" xmlns:wps="http://schemas.microsoft.com/office/word/2010/wordprocessingShape" mc:Ignorable="w14 w15 w16se w16cid w16 w16cex w16sdtdh w16sdtfl w16du wp14">
+  <w:footnote w:type="separator" w:id="-1">
+    <w:p>
+      <w:pPr>
+        <w:spacing w:after="0" w:line="240" w:lineRule="auto"/>
+      </w:pPr>
+      <w:r>
+        <w:separator/>
+      </w:r>
+    </w:p>
+  </w:footnote>
+  <w:footnote w:type="continuationSeparator" w:id="0">
+    <w:p>
+      <w:pPr>
+        <w:spacing w:after="0" w:line="240" w:lineRule="auto"/>
+      </w:pPr>
+      <w:r>
+        <w:continuationSeparator/>
+      </w:r>
+    </w:p>
+  </w:footnote>
+</w:footnotes>
+</file>
+
+<file path=word/header1.xml><?xml version="1.0" encoding="utf-8"?>
+<w:hdr xmlns:wpc="http://schemas.microsoft.com/office/word/2010/wordprocessingCanvas" xmlns:cx="http://schemas.microsoft.com/office/drawing/2014/chartex" xmlns:cx1="http://schemas.microsoft.com/office/drawing/2015/9/8/chartex" xmlns:cx2="http://schemas.microsoft.com/office/drawing/2015/10/21/chartex" xmlns:cx3="http://schemas.microsoft.com/office/drawing/2016/5/9/chartex" xmlns:cx4="http://schemas.microsoft.com/office/drawing/2016/5/10/chartex" xmlns:cx5="http://schemas.microsoft.com/office/drawing/2016/5/11/chartex" xmlns:cx6="http://schemas.microsoft.com/office/drawing/2016/5/12/chartex" xmlns:cx7="http://schemas.microsoft.com/office/drawing/2016/5/13/chartex" xmlns:cx8="http://schemas.microsoft.com/office/drawing/2016/5/14/chartex" xmlns:mc="http://schemas.openxmlformats.org/markup-compatibility/2006" xmlns:aink="http://schemas.microsoft.com/office/drawing/2016/ink" xmlns:am3d="http://schemas.microsoft.com/office/drawing/2017/model3d" xmlns:o="urn:schemas-microsoft-com:office:office" xmlns:oel="http://schemas.microsoft.com/office/2019/extlst" xmlns:r="http://schemas.openxmlformats.org/officeDocument/2006/relationships" xmlns:m="http://schemas.openxmlformats.org/officeDocument/2006/math" xmlns:v="urn:schemas-microsoft-com:vml" xmlns:wp14="http://schemas.microsoft.com/office/word/2010/wordprocessingDrawing" xmlns:wp="http://schemas.openxmlformats.org/drawingml/2006/wordprocessingDrawing" xmlns:w10="urn:schemas-microsoft-com:office:word" xmlns:w="http://schemas.openxmlformats.org/wordprocessingml/2006/main" xmlns:w14="http://schemas.microsoft.com/office/word/2010/wordml" xmlns:w15="http://schemas.microsoft.com/office/word/2012/wordml" xmlns:w16cex="http://schemas.microsoft.com/office/word/2018/wordml/cex" xmlns:w16cid="http://schemas.microsoft.com/office/word/2016/wordml/cid" xmlns:w16="http://schemas.microsoft.com/office/word/2018/wordml" xmlns:w16du="http://schemas.microsoft.com/office/word/2023/wordml/word16du" xmlns:w16sdtdh="http://schemas.microsoft.com/office/word/2020/wordml/sdtdatahash" xmlns:w16sdtfl="http://schemas.microsoft.com/office/word/2024/wordml/sdtformatlock" xmlns:w16se="http://schemas.microsoft.com/office/word/2015/wordml/symex" xmlns:wpg="http://schemas.microsoft.com/office/word/2010/wordprocessingGroup" xmlns:wpi="http://schemas.microsoft.com/office/word/2010/wordprocessingInk" xmlns:wne="http://schemas.microsoft.com/office/word/2006/wordml" xmlns:wps="http://schemas.microsoft.com/office/word/2010/wordprocessingShape" mc:Ignorable="w14 w15 w16se w16cid w16 w16cex w16sdtdh w16sdtfl w16du wp14">
+  <w:p>
+    <w:pPr>
+      <w:pStyle w:val="Header"/>
+    </w:pPr>
+  </w:p>
+</w:hdr>
+</file>
+
+<file path=word/header2.xml><?xml version="1.0" encoding="utf-8"?>
+<w:hdr xmlns:wpc="http://schemas.microsoft.com/office/word/2010/wordprocessingCanvas" xmlns:cx="http://schemas.microsoft.com/office/drawing/2014/chartex" xmlns:cx1="http://schemas.microsoft.com/office/drawing/2015/9/8/chartex" xmlns:cx2="http://schemas.microsoft.com/office/drawing/2015/10/21/chartex" xmlns:cx3="http://schemas.microsoft.com/office/drawing/2016/5/9/chartex" xmlns:cx4="http://schemas.microsoft.com/office/drawing/2016/5/10/chartex" xmlns:cx5="http://schemas.microsoft.com/office/drawing/2016/5/11/chartex" xmlns:cx6="http://schemas.microsoft.com/office/drawing/2016/5/12/chartex" xmlns:cx7="http://schemas.microsoft.com/office/drawing/2016/5/13/chartex" xmlns:cx8="http://schemas.microsoft.com/office/drawing/2016/5/14/chartex" xmlns:mc="http://schemas.openxmlformats.org/markup-compatibility/2006" xmlns:aink="http://schemas.microsoft.com/office/drawing/2016/ink" xmlns:am3d="http://schemas.microsoft.com/office/drawing/2017/model3d" xmlns:o="urn:schemas-microsoft-com:office:office" xmlns:oel="http://schemas.microsoft.com/office/2019/extlst" xmlns:r="http://schemas.openxmlformats.org/officeDocument/2006/relationships" xmlns:m="http://schemas.openxmlformats.org/officeDocument/2006/math" xmlns:v="urn:schemas-microsoft-com:vml" xmlns:wp14="http://schemas.microsoft.com/office/word/2010/wordprocessingDrawing" xmlns:wp="http://schemas.openxmlformats.org/drawingml/2006/wordprocessingDrawing" xmlns:w10="urn:schemas-microsoft-com:office:word" xmlns:w="http://schemas.openxmlformats.org/wordprocessingml/2006/main" xmlns:w14="http://schemas.microsoft.com/office/word/2010/wordml" xmlns:w15="http://schemas.microsoft.com/office/word/2012/wordml" xmlns:w16cex="http://schemas.microsoft.com/office/word/2018/wordml/cex" xmlns:w16cid="http://schemas.microsoft.com/office/word/2016/wordml/cid" xmlns:w16="http://schemas.microsoft.com/office/word/2018/wordml" xmlns:w16du="http://schemas.microsoft.com/office/word/2023/wordml/word16du" xmlns:w16sdtdh="http://schemas.microsoft.com/office/word/2020/wordml/sdtdatahash" xmlns:w16sdtfl="http://schemas.microsoft.com/office/word/2024/wordml/sdtformatlock" xmlns:w16se="http://schemas.microsoft.com/office/word/2015/wordml/symex" xmlns:wpg="http://schemas.microsoft.com/office/word/2010/wordprocessingGroup" xmlns:wpi="http://schemas.microsoft.com/office/word/2010/wordprocessingInk" xmlns:wne="http://schemas.microsoft.com/office/word/2006/wordml" xmlns:wps="http://schemas.microsoft.com/office/word/2010/wordprocessingShape" mc:Ignorable="w14 w15 w16se w16cid w16 w16cex w16sdtdh w16sdtfl w16du wp14">
+  <w:tbl>
+    <w:tblPr>
+      <w:tblStyle w:val="TableGrid"/>
+      <w:tblpPr w:vertAnchor="page" w:horzAnchor="page" w:tblpX="726" w:tblpY="725"/>
+      <w:tblOverlap w:val="never"/>
+      <w:tblW w:w="11023" w:type="dxa"/>
+      <w:tblInd w:w="0" w:type="dxa"/>
+      <w:tblCellMar>
+        <w:top w:w="5" w:type="dxa"/>
+        <w:left w:w="108" w:type="dxa"/>
+        <w:bottom w:w="3" w:type="dxa"/>
+        <w:right w:w="5" w:type="dxa"/>
+      </w:tblCellMar>
+      <w:tblLook w:val="04A0" w:firstRow="1" w:lastRow="0" w:firstColumn="1" w:lastColumn="0" w:noHBand="0" w:noVBand="1"/>
+    </w:tblPr>
+    <w:tblGrid>
+      <w:gridCol w:w="2376"/>
+      <w:gridCol w:w="8647"/>
+    </w:tblGrid>
+    <w:tr>
+      <w:trPr>
+        <w:trHeight w:val="896"/>
+      </w:trPr>
+      <w:tc>
+        <w:tcPr>
+          <w:tcW w:w="2376" w:type="dxa"/>
+          <w:tcBorders>
+            <w:top w:val="single" w:sz="4" w:space="0" w:color="000000"/>
+            <w:left w:val="single" w:sz="4" w:space="0" w:color="000000"/>
+            <w:bottom w:val="single" w:sz="4" w:space="0" w:color="000000"/>
+            <w:right w:val="single" w:sz="4" w:space="0" w:color="000000"/>
+          </w:tcBorders>
+          <w:vAlign w:val="bottom"/>
+        </w:tcPr>
+        <w:p>
+          <w:pPr>
+            <w:ind w:right="40"/>
+          </w:pPr>
+          <w:r>
+            <w:rPr>
+              <w:noProof/>
+              <w:lang w:eastAsia="en-IN"/>
+            </w:rPr>
+            <w:drawing>
+              <wp:inline distT="0" distB="0" distL="0" distR="0" wp14:anchorId="50DB878D" wp14:editId="10EC0384">
+                <wp:extent cx="1388110" cy="609457"/>
+                <wp:effectExtent l="0" t="0" r="2540" b="635"/>
+                <wp:docPr id="897849858" name="Picture 897849858"/>
+                <wp:cNvGraphicFramePr/>
+                <a:graphic xmlns:a="http://schemas.openxmlformats.org/drawingml/2006/main">
+                  <a:graphicData uri="http://schemas.openxmlformats.org/drawingml/2006/picture">
+                    <pic:pic xmlns:pic="http://schemas.openxmlformats.org/drawingml/2006/picture">
+                      <pic:nvPicPr>
+                        <pic:cNvPr id="262" name="Picture 262"/>
+                        <pic:cNvPicPr/>
+                      </pic:nvPicPr>
+                      <pic:blipFill>
+                        <a:blip r:embed="rId1"/>
+                        <a:stretch>
+                          <a:fillRect/>
+                        </a:stretch>
+                      </pic:blipFill>
+                      <pic:spPr>
+                        <a:xfrm>
+                          <a:off x="0" y="0"/>
+                          <a:ext cx="1397479" cy="613570"/>
+                        </a:xfrm>
+                        <a:prstGeom prst="rect">
+                          <a:avLst/>
+                        </a:prstGeom>
+                      </pic:spPr>
+                    </pic:pic>
+                  </a:graphicData>
+                </a:graphic>
+              </wp:inline>
+            </w:drawing>
+          </w:r>
+        </w:p>
+      </w:tc>
+      <w:tc>
+        <w:tcPr>
+          <w:tcW w:w="8647" w:type="dxa"/>
+          <w:tcBorders>
+            <w:top w:val="single" w:sz="4" w:space="0" w:color="000000"/>
+            <w:left w:val="single" w:sz="4" w:space="0" w:color="000000"/>
+            <w:bottom w:val="single" w:sz="4" w:space="0" w:color="000000"/>
+            <w:right w:val="single" w:sz="4" w:space="0" w:color="000000"/>
+          </w:tcBorders>
+        </w:tcPr>
+        <w:p>
+          <w:pPr>
+            <w:ind w:right="96"/>
+          </w:pPr>
+          <w:r>
+            <w:rPr>
+              <w:rFonts w:ascii="Times New Roman" w:eastAsia="Times New Roman" w:hAnsi="Times New Roman"/>
+              <w:color w:val="00000A"/>
+              <w:sz w:val="40"/>
+            </w:rPr>
+            <w:t xml:space="preserve">Department of Computer Engineering A.Y-2026-27 </w:t>
+          </w:r>
+        </w:p>
+      </w:tc>
+    </w:tr>
+  </w:tbl>
+  <w:p>
+    <w:pPr>
+      <w:pStyle w:val="Header"/>
+    </w:pPr>
+  </w:p>
+</w:hdr>
+</file>
+
+<file path=word/header3.xml><?xml version="1.0" encoding="utf-8"?>
+<w:hdr xmlns:wpc="http://schemas.microsoft.com/office/word/2010/wordprocessingCanvas" xmlns:cx="http://schemas.microsoft.com/office/drawing/2014/chartex" xmlns:cx1="http://schemas.microsoft.com/office/drawing/2015/9/8/chartex" xmlns:cx2="http://schemas.microsoft.com/office/drawing/2015/10/21/chartex" xmlns:cx3="http://schemas.microsoft.com/office/drawing/2016/5/9/chartex" xmlns:cx4="http://schemas.microsoft.com/office/drawing/2016/5/10/chartex" xmlns:cx5="http://schemas.microsoft.com/office/drawing/2016/5/11/chartex" xmlns:cx6="http://schemas.microsoft.com/office/drawing/2016/5/12/chartex" xmlns:cx7="http://schemas.microsoft.com/office/drawing/2016/5/13/chartex" xmlns:cx8="http://schemas.microsoft.com/office/drawing/2016/5/14/chartex" xmlns:mc="http://schemas.openxmlformats.org/markup-compatibility/2006" xmlns:aink="http://schemas.microsoft.com/office/drawing/2016/ink" xmlns:am3d="http://schemas.microsoft.com/office/drawing/2017/model3d" xmlns:o="urn:schemas-microsoft-com:office:office" xmlns:oel="http://schemas.microsoft.com/office/2019/extlst" xmlns:r="http://schemas.openxmlformats.org/officeDocument/2006/relationships" xmlns:m="http://schemas.openxmlformats.org/officeDocument/2006/math" xmlns:v="urn:schemas-microsoft-com:vml" xmlns:wp14="http://schemas.microsoft.com/office/word/2010/wordprocessingDrawing" xmlns:wp="http://schemas.openxmlformats.org/drawingml/2006/wordprocessingDrawing" xmlns:w10="urn:schemas-microsoft-com:office:word" xmlns:w="http://schemas.openxmlformats.org/wordprocessingml/2006/main" xmlns:w14="http://schemas.microsoft.com/office/word/2010/wordml" xmlns:w15="http://schemas.microsoft.com/office/word/2012/wordml" xmlns:w16cex="http://schemas.microsoft.com/office/word/2018/wordml/cex" xmlns:w16cid="http://schemas.microsoft.com/office/word/2016/wordml/cid" xmlns:w16="http://schemas.microsoft.com/office/word/2018/wordml" xmlns:w16du="http://schemas.microsoft.com/office/word/2023/wordml/word16du" xmlns:w16sdtdh="http://schemas.microsoft.com/office/word/2020/wordml/sdtdatahash" xmlns:w16sdtfl="http://schemas.microsoft.com/office/word/2024/wordml/sdtformatlock" xmlns:w16se="http://schemas.microsoft.com/office/word/2015/wordml/symex" xmlns:wpg="http://schemas.microsoft.com/office/word/2010/wordprocessingGroup" xmlns:wpi="http://schemas.microsoft.com/office/word/2010/wordprocessingInk" xmlns:wne="http://schemas.microsoft.com/office/word/2006/wordml" xmlns:wps="http://schemas.microsoft.com/office/word/2010/wordprocessingShape" mc:Ignorable="w14 w15 w16se w16cid w16 w16cex w16sdtdh w16sdtfl w16du wp14">
+  <w:p>
+    <w:pPr>
+      <w:pStyle w:val="Header"/>
+    </w:pPr>
+  </w:p>
+</w:hdr>
 </file>
 
 <file path=word/styles.xml><?xml version="1.0" encoding="utf-8"?>
@@ -1037,6 +1268,7 @@
   <w:style w:type="character" w:default="1" w:styleId="DefaultParagraphFont">
     <w:name w:val="Default Paragraph Font"/>
     <w:uiPriority w:val="1"/>
+    <w:semiHidden/>
     <w:unhideWhenUsed/>
   </w:style>
   <w:style w:type="table" w:default="1" w:styleId="TableNormal">
@@ -1349,6 +1581,69 @@
       <w:color w:val="2F5496" w:themeColor="accent1" w:themeShade="BF"/>
       <w:spacing w:val="5"/>
     </w:rPr>
+  </w:style>
+  <w:style w:type="paragraph" w:styleId="Header">
+    <w:name w:val="header"/>
+    <w:basedOn w:val="Normal"/>
+    <w:link w:val="HeaderChar"/>
+    <w:uiPriority w:val="99"/>
+    <w:unhideWhenUsed/>
+    <w:rsid w:val="0042072D"/>
+    <w:pPr>
+      <w:tabs>
+        <w:tab w:val="center" w:pos="4680"/>
+        <w:tab w:val="right" w:pos="9360"/>
+      </w:tabs>
+      <w:spacing w:after="0" w:line="240" w:lineRule="auto"/>
+    </w:pPr>
+  </w:style>
+  <w:style w:type="character" w:customStyle="1" w:styleId="HeaderChar">
+    <w:name w:val="Header Char"/>
+    <w:basedOn w:val="DefaultParagraphFont"/>
+    <w:link w:val="Header"/>
+    <w:uiPriority w:val="99"/>
+    <w:rsid w:val="0042072D"/>
+  </w:style>
+  <w:style w:type="paragraph" w:styleId="Footer">
+    <w:name w:val="footer"/>
+    <w:basedOn w:val="Normal"/>
+    <w:link w:val="FooterChar"/>
+    <w:uiPriority w:val="99"/>
+    <w:unhideWhenUsed/>
+    <w:rsid w:val="0042072D"/>
+    <w:pPr>
+      <w:tabs>
+        <w:tab w:val="center" w:pos="4680"/>
+        <w:tab w:val="right" w:pos="9360"/>
+      </w:tabs>
+      <w:spacing w:after="0" w:line="240" w:lineRule="auto"/>
+    </w:pPr>
+  </w:style>
+  <w:style w:type="character" w:customStyle="1" w:styleId="FooterChar">
+    <w:name w:val="Footer Char"/>
+    <w:basedOn w:val="DefaultParagraphFont"/>
+    <w:link w:val="Footer"/>
+    <w:uiPriority w:val="99"/>
+    <w:rsid w:val="0042072D"/>
+  </w:style>
+  <w:style w:type="table" w:customStyle="1" w:styleId="TableGrid">
+    <w:name w:val="TableGrid"/>
+    <w:rsid w:val="0042072D"/>
+    <w:pPr>
+      <w:spacing w:after="0" w:line="240" w:lineRule="auto"/>
+    </w:pPr>
+    <w:rPr>
+      <w:rFonts w:eastAsiaTheme="minorEastAsia"/>
+      <w:lang w:val="en-IN"/>
+    </w:rPr>
+    <w:tblPr>
+      <w:tblCellMar>
+        <w:top w:w="0" w:type="dxa"/>
+        <w:left w:w="0" w:type="dxa"/>
+        <w:bottom w:w="0" w:type="dxa"/>
+        <w:right w:w="0" w:type="dxa"/>
+      </w:tblCellMar>
+    </w:tblPr>
   </w:style>
 </w:styles>
 </file>

</xml_diff>